<commit_message>
Polish repo for UW Dubs Codex Pet
</commit_message>
<xml_diff>
--- a/docs/Dubs_Buddy_Setup_Guide.docx
+++ b/docs/Dubs_Buddy_Setup_Guide.docx
@@ -134,7 +134,7 @@
                 <w:color w:val="111827"/>
                 <w:sz w:val="21"/>
               </w:rPr>
-              <w:t>github.com/FlalaGoGoGo/dubs-buddy-codex-pet</w:t>
+              <w:t>github.com/FlalaGoGoGo/uw-dubs-codex-pet</w:t>
             </w:r>
           </w:p>
         </w:tc>
@@ -289,7 +289,7 @@
           <w:color w:val="111827"/>
           <w:sz w:val="21"/>
         </w:rPr>
-        <w:t>Download dubs-buddy-codex-pet-v3.1.0.zip from the latest GitHub release.</w:t>
+        <w:t>Download uw-dubs-codex-pet-v3.1.0.zip from the latest GitHub release.</w:t>
       </w:r>
     </w:p>
     <w:p>
@@ -733,7 +733,7 @@
                 <w:color w:val="111827"/>
                 <w:sz w:val="18"/>
               </w:rPr>
-              <w:t>git clone https://github.com/FlalaGoGoGo/dubs-buddy-codex-pet.git</w:t>
+              <w:t>git clone https://github.com/FlalaGoGoGo/uw-dubs-codex-pet.git</w:t>
             </w:r>
             <w:r>
               <w:br/>
@@ -744,7 +744,7 @@
                 <w:color w:val="111827"/>
                 <w:sz w:val="18"/>
               </w:rPr>
-              <w:t>cd dubs-buddy-codex-pet</w:t>
+              <w:t>cd uw-dubs-codex-pet</w:t>
             </w:r>
             <w:r>
               <w:br/>
@@ -2806,7 +2806,7 @@
           <w:color w:val="111827"/>
           <w:sz w:val="21"/>
         </w:rPr>
-        <w:t>Keep Dubs.png as the visual style reference.</w:t>
+        <w:t>Keep references/style/Dubs.png as the visual style reference.</w:t>
       </w:r>
     </w:p>
     <w:p>
@@ -2821,7 +2821,7 @@
           <w:color w:val="111827"/>
           <w:sz w:val="21"/>
         </w:rPr>
-        <w:t>Place new 4 x 2, eight-frame reference sheets in v3_1_references.</w:t>
+        <w:t>Place current 4 x 2, eight-frame reference sheets in references/source-sheets.</w:t>
       </w:r>
     </w:p>
     <w:p>

</xml_diff>

<commit_message>
Update project description to UW Foster student project
</commit_message>
<xml_diff>
--- a/docs/Dubs_Buddy_Setup_Guide.docx
+++ b/docs/Dubs_Buddy_Setup_Guide.docx
@@ -220,7 +220,7 @@
           <w:color w:val="111827"/>
           <w:sz w:val="21"/>
         </w:rPr>
-        <w:t>Dubs Buddy is an unofficial UW-inspired custom pet for Codex Desktop. It is not a separate desktop app; users install it through Codex's native Custom pets feature.</w:t>
+        <w:t>Created by a UW Foster master's student, Dubs Buddy is a Codex Desktop custom pet. It is not a separate desktop app; users install it through Codex's native Custom pets feature.</w:t>
       </w:r>
     </w:p>
     <w:tbl>
@@ -3294,7 +3294,7 @@
           <w:color w:val="111827"/>
           <w:sz w:val="21"/>
         </w:rPr>
-        <w:t>This is a non-commercial, unofficial fan project. It is not affiliated with, sponsored by, or endorsed by the University of Washington or OpenAI.</w:t>
+        <w:t>Dubs Buddy was created by a UW Foster master's student as a non-commercial Codex Desktop custom pet project. It is not affiliated with, sponsored by, or endorsed by the University of Washington or OpenAI.</w:t>
       </w:r>
     </w:p>
     <w:p>
@@ -3372,7 +3372,7 @@
                 <w:color w:val="111827"/>
                 <w:sz w:val="20"/>
               </w:rPr>
-              <w:t>I built Dubs Buddy, an unofficial UW-inspired custom pet for Codex Desktop. Download the release zip, copy the dubs-buddy folder into Codex's custom pets directory, then enable it from Appearance -&gt; Pets -&gt; Custom pets. Go Dawgs, and may your tests pass.</w:t>
+              <w:t>I built Dubs Buddy as a UW Foster master's student: a Codex Desktop custom pet that brings a small Dubs-style coding companion into Codex. Download the release zip, copy the dubs-buddy folder into Codex's custom pets directory, then enable it from Appearance -&gt; Pets -&gt; Custom pets. Go Dawgs, and may your tests pass.</w:t>
             </w:r>
           </w:p>
         </w:tc>
@@ -3403,7 +3403,7 @@
         <w:color w:val="4B5563"/>
         <w:sz w:val="18"/>
       </w:rPr>
-      <w:t>Unofficial fan project | v3.1.0</w:t>
+      <w:t>UW Foster student project | v3.1.0</w:t>
     </w:r>
   </w:p>
 </w:ftr>

</xml_diff>